<commit_message>
edit rattle N table and add to supp
</commit_message>
<xml_diff>
--- a/Supplemental.docx
+++ b/Supplemental.docx
@@ -3978,6 +3978,1149 @@
             </w:pPr>
             <w:r>
               <w:t xml:space="preserve">5</w:t>
+            </w:r>
+          </w:p>
+        </w:tc>
+      </w:tr>
+    </w:tbl>
+    <w:p/>
+    <w:p>
+      <w:pPr>
+        <w:pStyle w:val="TableCaption"/>
+      </w:pPr>
+      <w:r>
+        <w:t xml:space="preserve">Supplementary Table 2. Sample size of juveniles, litters, and female red squirrels, by year and treatment during the rattle playback experiment.</w:t>
+      </w:r>
+    </w:p>
+    <w:tbl>
+      <w:tblPr>
+        <w:tblStyle w:val="Table"/>
+        <w:tblW w:type="auto" w:w="0"/>
+        <w:tblLook w:firstRow="1" w:lastRow="0" w:firstColumn="0" w:lastColumn="0" w:noHBand="0" w:noVBand="0" w:val="0020"/>
+        <w:tblCaption w:val="Supplementary Table 2. Sample size of juveniles, litters, and female red squirrels, by year and treatment during the rattle playback experiment."/>
+      </w:tblPr>
+      <w:tblGrid>
+        <w:gridCol w:w="1584"/>
+        <w:gridCol w:w="1584"/>
+        <w:gridCol w:w="1584"/>
+        <w:gridCol w:w="1584"/>
+        <w:gridCol w:w="1584"/>
+      </w:tblGrid>
+      <w:tr>
+        <w:trPr>
+          <w:tblHeader w:val="on"/>
+        </w:trPr>
+        <w:tc>
+          <w:tcPr/>
+          <w:p>
+            <w:pPr>
+              <w:pStyle w:val="Compact"/>
+              <w:jc w:val="right"/>
+            </w:pPr>
+            <w:r>
+              <w:t xml:space="preserve">Year</w:t>
+            </w:r>
+          </w:p>
+        </w:tc>
+        <w:tc>
+          <w:tcPr/>
+          <w:p>
+            <w:pPr>
+              <w:pStyle w:val="Compact"/>
+              <w:jc w:val="left"/>
+            </w:pPr>
+            <w:r>
+              <w:t xml:space="preserve">Treatment</w:t>
+            </w:r>
+          </w:p>
+        </w:tc>
+        <w:tc>
+          <w:tcPr/>
+          <w:p>
+            <w:pPr>
+              <w:pStyle w:val="Compact"/>
+              <w:jc w:val="right"/>
+            </w:pPr>
+            <w:r>
+              <w:t xml:space="preserve">N_juveniles</w:t>
+            </w:r>
+          </w:p>
+        </w:tc>
+        <w:tc>
+          <w:tcPr/>
+          <w:p>
+            <w:pPr>
+              <w:pStyle w:val="Compact"/>
+              <w:jc w:val="right"/>
+            </w:pPr>
+            <w:r>
+              <w:t xml:space="preserve">N_litters</w:t>
+            </w:r>
+          </w:p>
+        </w:tc>
+        <w:tc>
+          <w:tcPr/>
+          <w:p>
+            <w:pPr>
+              <w:pStyle w:val="Compact"/>
+              <w:jc w:val="right"/>
+            </w:pPr>
+            <w:r>
+              <w:t xml:space="preserve">N_females</w:t>
+            </w:r>
+          </w:p>
+        </w:tc>
+      </w:tr>
+      <w:tr>
+        <w:tc>
+          <w:tcPr/>
+          <w:p>
+            <w:pPr>
+              <w:pStyle w:val="Compact"/>
+              <w:jc w:val="right"/>
+            </w:pPr>
+            <w:r>
+              <w:t xml:space="preserve">2010</w:t>
+            </w:r>
+          </w:p>
+        </w:tc>
+        <w:tc>
+          <w:tcPr/>
+          <w:p>
+            <w:pPr>
+              <w:pStyle w:val="Compact"/>
+              <w:jc w:val="left"/>
+            </w:pPr>
+            <w:r>
+              <w:t xml:space="preserve">Control</w:t>
+            </w:r>
+          </w:p>
+        </w:tc>
+        <w:tc>
+          <w:tcPr/>
+          <w:p>
+            <w:pPr>
+              <w:pStyle w:val="Compact"/>
+              <w:jc w:val="right"/>
+            </w:pPr>
+            <w:r>
+              <w:t xml:space="preserve">25</w:t>
+            </w:r>
+          </w:p>
+        </w:tc>
+        <w:tc>
+          <w:tcPr/>
+          <w:p>
+            <w:pPr>
+              <w:pStyle w:val="Compact"/>
+              <w:jc w:val="right"/>
+            </w:pPr>
+            <w:r>
+              <w:t xml:space="preserve">6</w:t>
+            </w:r>
+          </w:p>
+        </w:tc>
+        <w:tc>
+          <w:tcPr/>
+          <w:p>
+            <w:pPr>
+              <w:pStyle w:val="Compact"/>
+              <w:jc w:val="right"/>
+            </w:pPr>
+            <w:r>
+              <w:t xml:space="preserve">6</w:t>
+            </w:r>
+          </w:p>
+        </w:tc>
+      </w:tr>
+      <w:tr>
+        <w:tc>
+          <w:tcPr/>
+          <w:p>
+            <w:pPr>
+              <w:pStyle w:val="Compact"/>
+              <w:jc w:val="right"/>
+            </w:pPr>
+            <w:r>
+              <w:t xml:space="preserve">2010</w:t>
+            </w:r>
+          </w:p>
+        </w:tc>
+        <w:tc>
+          <w:tcPr/>
+          <w:p>
+            <w:pPr>
+              <w:pStyle w:val="Compact"/>
+              <w:jc w:val="left"/>
+            </w:pPr>
+            <w:r>
+              <w:t xml:space="preserve">Rattle</w:t>
+            </w:r>
+          </w:p>
+        </w:tc>
+        <w:tc>
+          <w:tcPr/>
+          <w:p>
+            <w:pPr>
+              <w:pStyle w:val="Compact"/>
+              <w:jc w:val="right"/>
+            </w:pPr>
+            <w:r>
+              <w:t xml:space="preserve">74</w:t>
+            </w:r>
+          </w:p>
+        </w:tc>
+        <w:tc>
+          <w:tcPr/>
+          <w:p>
+            <w:pPr>
+              <w:pStyle w:val="Compact"/>
+              <w:jc w:val="right"/>
+            </w:pPr>
+            <w:r>
+              <w:t xml:space="preserve">19</w:t>
+            </w:r>
+          </w:p>
+        </w:tc>
+        <w:tc>
+          <w:tcPr/>
+          <w:p>
+            <w:pPr>
+              <w:pStyle w:val="Compact"/>
+              <w:jc w:val="right"/>
+            </w:pPr>
+            <w:r>
+              <w:t xml:space="preserve">19</w:t>
+            </w:r>
+          </w:p>
+        </w:tc>
+      </w:tr>
+      <w:tr>
+        <w:tc>
+          <w:tcPr/>
+          <w:p>
+            <w:pPr>
+              <w:pStyle w:val="Compact"/>
+              <w:jc w:val="right"/>
+            </w:pPr>
+            <w:r>
+              <w:t xml:space="preserve">2010</w:t>
+            </w:r>
+          </w:p>
+        </w:tc>
+        <w:tc>
+          <w:tcPr/>
+          <w:p>
+            <w:pPr>
+              <w:pStyle w:val="Compact"/>
+              <w:jc w:val="left"/>
+            </w:pPr>
+            <w:r>
+              <w:t xml:space="preserve">Chickadee</w:t>
+            </w:r>
+          </w:p>
+        </w:tc>
+        <w:tc>
+          <w:tcPr/>
+          <w:p>
+            <w:pPr>
+              <w:pStyle w:val="Compact"/>
+              <w:jc w:val="right"/>
+            </w:pPr>
+            <w:r>
+              <w:t xml:space="preserve">47</w:t>
+            </w:r>
+          </w:p>
+        </w:tc>
+        <w:tc>
+          <w:tcPr/>
+          <w:p>
+            <w:pPr>
+              <w:pStyle w:val="Compact"/>
+              <w:jc w:val="right"/>
+            </w:pPr>
+            <w:r>
+              <w:t xml:space="preserve">13</w:t>
+            </w:r>
+          </w:p>
+        </w:tc>
+        <w:tc>
+          <w:tcPr/>
+          <w:p>
+            <w:pPr>
+              <w:pStyle w:val="Compact"/>
+              <w:jc w:val="right"/>
+            </w:pPr>
+            <w:r>
+              <w:t xml:space="preserve">13</w:t>
+            </w:r>
+          </w:p>
+        </w:tc>
+      </w:tr>
+      <w:tr>
+        <w:tc>
+          <w:tcPr/>
+          <w:p>
+            <w:pPr>
+              <w:pStyle w:val="Compact"/>
+              <w:jc w:val="right"/>
+            </w:pPr>
+            <w:r>
+              <w:t xml:space="preserve">2018</w:t>
+            </w:r>
+          </w:p>
+        </w:tc>
+        <w:tc>
+          <w:tcPr/>
+          <w:p>
+            <w:pPr>
+              <w:pStyle w:val="Compact"/>
+              <w:jc w:val="left"/>
+            </w:pPr>
+            <w:r>
+              <w:t xml:space="preserve">Control</w:t>
+            </w:r>
+          </w:p>
+        </w:tc>
+        <w:tc>
+          <w:tcPr/>
+          <w:p>
+            <w:pPr>
+              <w:pStyle w:val="Compact"/>
+              <w:jc w:val="right"/>
+            </w:pPr>
+            <w:r>
+              <w:t xml:space="preserve">209</w:t>
+            </w:r>
+          </w:p>
+        </w:tc>
+        <w:tc>
+          <w:tcPr/>
+          <w:p>
+            <w:pPr>
+              <w:pStyle w:val="Compact"/>
+              <w:jc w:val="right"/>
+            </w:pPr>
+            <w:r>
+              <w:t xml:space="preserve">75</w:t>
+            </w:r>
+          </w:p>
+        </w:tc>
+        <w:tc>
+          <w:tcPr/>
+          <w:p>
+            <w:pPr>
+              <w:pStyle w:val="Compact"/>
+              <w:jc w:val="right"/>
+            </w:pPr>
+            <w:r>
+              <w:t xml:space="preserve">75</w:t>
+            </w:r>
+          </w:p>
+        </w:tc>
+      </w:tr>
+      <w:tr>
+        <w:tc>
+          <w:tcPr/>
+          <w:p>
+            <w:pPr>
+              <w:pStyle w:val="Compact"/>
+              <w:jc w:val="right"/>
+            </w:pPr>
+            <w:r>
+              <w:t xml:space="preserve">2018</w:t>
+            </w:r>
+          </w:p>
+        </w:tc>
+        <w:tc>
+          <w:tcPr/>
+          <w:p>
+            <w:pPr>
+              <w:pStyle w:val="Compact"/>
+              <w:jc w:val="left"/>
+            </w:pPr>
+            <w:r>
+              <w:t xml:space="preserve">Rattle</w:t>
+            </w:r>
+          </w:p>
+        </w:tc>
+        <w:tc>
+          <w:tcPr/>
+          <w:p>
+            <w:pPr>
+              <w:pStyle w:val="Compact"/>
+              <w:jc w:val="right"/>
+            </w:pPr>
+            <w:r>
+              <w:t xml:space="preserve">53</w:t>
+            </w:r>
+          </w:p>
+        </w:tc>
+        <w:tc>
+          <w:tcPr/>
+          <w:p>
+            <w:pPr>
+              <w:pStyle w:val="Compact"/>
+              <w:jc w:val="right"/>
+            </w:pPr>
+            <w:r>
+              <w:t xml:space="preserve">20</w:t>
+            </w:r>
+          </w:p>
+        </w:tc>
+        <w:tc>
+          <w:tcPr/>
+          <w:p>
+            <w:pPr>
+              <w:pStyle w:val="Compact"/>
+              <w:jc w:val="right"/>
+            </w:pPr>
+            <w:r>
+              <w:t xml:space="preserve">20</w:t>
+            </w:r>
+          </w:p>
+        </w:tc>
+      </w:tr>
+      <w:tr>
+        <w:tc>
+          <w:tcPr/>
+          <w:p>
+            <w:pPr>
+              <w:pStyle w:val="Compact"/>
+              <w:jc w:val="right"/>
+            </w:pPr>
+            <w:r>
+              <w:t xml:space="preserve">2020</w:t>
+            </w:r>
+          </w:p>
+        </w:tc>
+        <w:tc>
+          <w:tcPr/>
+          <w:p>
+            <w:pPr>
+              <w:pStyle w:val="Compact"/>
+              <w:jc w:val="left"/>
+            </w:pPr>
+            <w:r>
+              <w:t xml:space="preserve">Control</w:t>
+            </w:r>
+          </w:p>
+        </w:tc>
+        <w:tc>
+          <w:tcPr/>
+          <w:p>
+            <w:pPr>
+              <w:pStyle w:val="Compact"/>
+              <w:jc w:val="right"/>
+            </w:pPr>
+            <w:r>
+              <w:t xml:space="preserve">66</w:t>
+            </w:r>
+          </w:p>
+        </w:tc>
+        <w:tc>
+          <w:tcPr/>
+          <w:p>
+            <w:pPr>
+              <w:pStyle w:val="Compact"/>
+              <w:jc w:val="right"/>
+            </w:pPr>
+            <w:r>
+              <w:t xml:space="preserve">19</w:t>
+            </w:r>
+          </w:p>
+        </w:tc>
+        <w:tc>
+          <w:tcPr/>
+          <w:p>
+            <w:pPr>
+              <w:pStyle w:val="Compact"/>
+              <w:jc w:val="right"/>
+            </w:pPr>
+            <w:r>
+              <w:t xml:space="preserve">19</w:t>
+            </w:r>
+          </w:p>
+        </w:tc>
+      </w:tr>
+      <w:tr>
+        <w:tc>
+          <w:tcPr/>
+          <w:p>
+            <w:pPr>
+              <w:pStyle w:val="Compact"/>
+              <w:jc w:val="right"/>
+            </w:pPr>
+            <w:r>
+              <w:t xml:space="preserve">2019</w:t>
+            </w:r>
+          </w:p>
+        </w:tc>
+        <w:tc>
+          <w:tcPr/>
+          <w:p>
+            <w:pPr>
+              <w:pStyle w:val="Compact"/>
+              <w:jc w:val="left"/>
+            </w:pPr>
+            <w:r>
+              <w:t xml:space="preserve">Control</w:t>
+            </w:r>
+          </w:p>
+        </w:tc>
+        <w:tc>
+          <w:tcPr/>
+          <w:p>
+            <w:pPr>
+              <w:pStyle w:val="Compact"/>
+              <w:jc w:val="right"/>
+            </w:pPr>
+            <w:r>
+              <w:t xml:space="preserve">64</w:t>
+            </w:r>
+          </w:p>
+        </w:tc>
+        <w:tc>
+          <w:tcPr/>
+          <w:p>
+            <w:pPr>
+              <w:pStyle w:val="Compact"/>
+              <w:jc w:val="right"/>
+            </w:pPr>
+            <w:r>
+              <w:t xml:space="preserve">14</w:t>
+            </w:r>
+          </w:p>
+        </w:tc>
+        <w:tc>
+          <w:tcPr/>
+          <w:p>
+            <w:pPr>
+              <w:pStyle w:val="Compact"/>
+              <w:jc w:val="right"/>
+            </w:pPr>
+            <w:r>
+              <w:t xml:space="preserve">14</w:t>
+            </w:r>
+          </w:p>
+        </w:tc>
+      </w:tr>
+      <w:tr>
+        <w:tc>
+          <w:tcPr/>
+          <w:p>
+            <w:pPr>
+              <w:pStyle w:val="Compact"/>
+              <w:jc w:val="right"/>
+            </w:pPr>
+            <w:r>
+              <w:t xml:space="preserve">2019</w:t>
+            </w:r>
+          </w:p>
+        </w:tc>
+        <w:tc>
+          <w:tcPr/>
+          <w:p>
+            <w:pPr>
+              <w:pStyle w:val="Compact"/>
+              <w:jc w:val="left"/>
+            </w:pPr>
+            <w:r>
+              <w:t xml:space="preserve">Rattle</w:t>
+            </w:r>
+          </w:p>
+        </w:tc>
+        <w:tc>
+          <w:tcPr/>
+          <w:p>
+            <w:pPr>
+              <w:pStyle w:val="Compact"/>
+              <w:jc w:val="right"/>
+            </w:pPr>
+            <w:r>
+              <w:t xml:space="preserve">17</w:t>
+            </w:r>
+          </w:p>
+        </w:tc>
+        <w:tc>
+          <w:tcPr/>
+          <w:p>
+            <w:pPr>
+              <w:pStyle w:val="Compact"/>
+              <w:jc w:val="right"/>
+            </w:pPr>
+            <w:r>
+              <w:t xml:space="preserve">5</w:t>
+            </w:r>
+          </w:p>
+        </w:tc>
+        <w:tc>
+          <w:tcPr/>
+          <w:p>
+            <w:pPr>
+              <w:pStyle w:val="Compact"/>
+              <w:jc w:val="right"/>
+            </w:pPr>
+            <w:r>
+              <w:t xml:space="preserve">5</w:t>
+            </w:r>
+          </w:p>
+        </w:tc>
+      </w:tr>
+      <w:tr>
+        <w:tc>
+          <w:tcPr/>
+          <w:p>
+            <w:pPr>
+              <w:pStyle w:val="Compact"/>
+              <w:jc w:val="right"/>
+            </w:pPr>
+            <w:r>
+              <w:t xml:space="preserve">2020</w:t>
+            </w:r>
+          </w:p>
+        </w:tc>
+        <w:tc>
+          <w:tcPr/>
+          <w:p>
+            <w:pPr>
+              <w:pStyle w:val="Compact"/>
+              <w:jc w:val="left"/>
+            </w:pPr>
+            <w:r>
+              <w:t xml:space="preserve">Rattle</w:t>
+            </w:r>
+          </w:p>
+        </w:tc>
+        <w:tc>
+          <w:tcPr/>
+          <w:p>
+            <w:pPr>
+              <w:pStyle w:val="Compact"/>
+              <w:jc w:val="right"/>
+            </w:pPr>
+            <w:r>
+              <w:t xml:space="preserve">34</w:t>
+            </w:r>
+          </w:p>
+        </w:tc>
+        <w:tc>
+          <w:tcPr/>
+          <w:p>
+            <w:pPr>
+              <w:pStyle w:val="Compact"/>
+              <w:jc w:val="right"/>
+            </w:pPr>
+            <w:r>
+              <w:t xml:space="preserve">10</w:t>
+            </w:r>
+          </w:p>
+        </w:tc>
+        <w:tc>
+          <w:tcPr/>
+          <w:p>
+            <w:pPr>
+              <w:pStyle w:val="Compact"/>
+              <w:jc w:val="right"/>
+            </w:pPr>
+            <w:r>
+              <w:t xml:space="preserve">10</w:t>
+            </w:r>
+          </w:p>
+        </w:tc>
+      </w:tr>
+      <w:tr>
+        <w:tc>
+          <w:tcPr/>
+          <w:p>
+            <w:pPr>
+              <w:pStyle w:val="Compact"/>
+              <w:jc w:val="right"/>
+            </w:pPr>
+            <w:r>
+              <w:t xml:space="preserve">2019</w:t>
+            </w:r>
+          </w:p>
+        </w:tc>
+        <w:tc>
+          <w:tcPr/>
+          <w:p>
+            <w:pPr>
+              <w:pStyle w:val="Compact"/>
+              <w:jc w:val="left"/>
+            </w:pPr>
+            <w:r>
+              <w:t xml:space="preserve">Chickadee</w:t>
+            </w:r>
+          </w:p>
+        </w:tc>
+        <w:tc>
+          <w:tcPr/>
+          <w:p>
+            <w:pPr>
+              <w:pStyle w:val="Compact"/>
+              <w:jc w:val="right"/>
+            </w:pPr>
+            <w:r>
+              <w:t xml:space="preserve">7</w:t>
+            </w:r>
+          </w:p>
+        </w:tc>
+        <w:tc>
+          <w:tcPr/>
+          <w:p>
+            <w:pPr>
+              <w:pStyle w:val="Compact"/>
+              <w:jc w:val="right"/>
+            </w:pPr>
+            <w:r>
+              <w:t xml:space="preserve">2</w:t>
+            </w:r>
+          </w:p>
+        </w:tc>
+        <w:tc>
+          <w:tcPr/>
+          <w:p>
+            <w:pPr>
+              <w:pStyle w:val="Compact"/>
+              <w:jc w:val="right"/>
+            </w:pPr>
+            <w:r>
+              <w:t xml:space="preserve">2</w:t>
+            </w:r>
+          </w:p>
+        </w:tc>
+      </w:tr>
+      <w:tr>
+        <w:tc>
+          <w:tcPr/>
+          <w:p>
+            <w:pPr>
+              <w:pStyle w:val="Compact"/>
+              <w:jc w:val="right"/>
+            </w:pPr>
+            <w:r>
+              <w:t xml:space="preserve">2018</w:t>
+            </w:r>
+          </w:p>
+        </w:tc>
+        <w:tc>
+          <w:tcPr/>
+          <w:p>
+            <w:pPr>
+              <w:pStyle w:val="Compact"/>
+              <w:jc w:val="left"/>
+            </w:pPr>
+            <w:r>
+              <w:t xml:space="preserve">Chickadee</w:t>
+            </w:r>
+          </w:p>
+        </w:tc>
+        <w:tc>
+          <w:tcPr/>
+          <w:p>
+            <w:pPr>
+              <w:pStyle w:val="Compact"/>
+              <w:jc w:val="right"/>
+            </w:pPr>
+            <w:r>
+              <w:t xml:space="preserve">12</w:t>
+            </w:r>
+          </w:p>
+        </w:tc>
+        <w:tc>
+          <w:tcPr/>
+          <w:p>
+            <w:pPr>
+              <w:pStyle w:val="Compact"/>
+              <w:jc w:val="right"/>
+            </w:pPr>
+            <w:r>
+              <w:t xml:space="preserve">4</w:t>
+            </w:r>
+          </w:p>
+        </w:tc>
+        <w:tc>
+          <w:tcPr/>
+          <w:p>
+            <w:pPr>
+              <w:pStyle w:val="Compact"/>
+              <w:jc w:val="right"/>
+            </w:pPr>
+            <w:r>
+              <w:t xml:space="preserve">4</w:t>
+            </w:r>
+          </w:p>
+        </w:tc>
+      </w:tr>
+      <w:tr>
+        <w:tc>
+          <w:tcPr/>
+          <w:p>
+            <w:pPr>
+              <w:pStyle w:val="Compact"/>
+              <w:jc w:val="right"/>
+            </w:pPr>
+            <w:r>
+              <w:t xml:space="preserve">2021</w:t>
+            </w:r>
+          </w:p>
+        </w:tc>
+        <w:tc>
+          <w:tcPr/>
+          <w:p>
+            <w:pPr>
+              <w:pStyle w:val="Compact"/>
+              <w:jc w:val="left"/>
+            </w:pPr>
+            <w:r>
+              <w:t xml:space="preserve">Control</w:t>
+            </w:r>
+          </w:p>
+        </w:tc>
+        <w:tc>
+          <w:tcPr/>
+          <w:p>
+            <w:pPr>
+              <w:pStyle w:val="Compact"/>
+              <w:jc w:val="right"/>
+            </w:pPr>
+            <w:r>
+              <w:t xml:space="preserve">64</w:t>
+            </w:r>
+          </w:p>
+        </w:tc>
+        <w:tc>
+          <w:tcPr/>
+          <w:p>
+            <w:pPr>
+              <w:pStyle w:val="Compact"/>
+              <w:jc w:val="right"/>
+            </w:pPr>
+            <w:r>
+              <w:t xml:space="preserve">22</w:t>
+            </w:r>
+          </w:p>
+        </w:tc>
+        <w:tc>
+          <w:tcPr/>
+          <w:p>
+            <w:pPr>
+              <w:pStyle w:val="Compact"/>
+              <w:jc w:val="right"/>
+            </w:pPr>
+            <w:r>
+              <w:t xml:space="preserve">22</w:t>
+            </w:r>
+          </w:p>
+        </w:tc>
+      </w:tr>
+      <w:tr>
+        <w:tc>
+          <w:tcPr/>
+          <w:p>
+            <w:pPr>
+              <w:pStyle w:val="Compact"/>
+              <w:jc w:val="right"/>
+            </w:pPr>
+            <w:r>
+              <w:t xml:space="preserve">2020</w:t>
+            </w:r>
+          </w:p>
+        </w:tc>
+        <w:tc>
+          <w:tcPr/>
+          <w:p>
+            <w:pPr>
+              <w:pStyle w:val="Compact"/>
+              <w:jc w:val="left"/>
+            </w:pPr>
+            <w:r>
+              <w:t xml:space="preserve">Chickadee</w:t>
+            </w:r>
+          </w:p>
+        </w:tc>
+        <w:tc>
+          <w:tcPr/>
+          <w:p>
+            <w:pPr>
+              <w:pStyle w:val="Compact"/>
+              <w:jc w:val="right"/>
+            </w:pPr>
+            <w:r>
+              <w:t xml:space="preserve">9</w:t>
+            </w:r>
+          </w:p>
+        </w:tc>
+        <w:tc>
+          <w:tcPr/>
+          <w:p>
+            <w:pPr>
+              <w:pStyle w:val="Compact"/>
+              <w:jc w:val="right"/>
+            </w:pPr>
+            <w:r>
+              <w:t xml:space="preserve">3</w:t>
+            </w:r>
+          </w:p>
+        </w:tc>
+        <w:tc>
+          <w:tcPr/>
+          <w:p>
+            <w:pPr>
+              <w:pStyle w:val="Compact"/>
+              <w:jc w:val="right"/>
+            </w:pPr>
+            <w:r>
+              <w:t xml:space="preserve">3</w:t>
+            </w:r>
+          </w:p>
+        </w:tc>
+      </w:tr>
+      <w:tr>
+        <w:tc>
+          <w:tcPr/>
+          <w:p>
+            <w:pPr>
+              <w:pStyle w:val="Compact"/>
+              <w:jc w:val="right"/>
+            </w:pPr>
+            <w:r>
+              <w:t xml:space="preserve">2021</w:t>
+            </w:r>
+          </w:p>
+        </w:tc>
+        <w:tc>
+          <w:tcPr/>
+          <w:p>
+            <w:pPr>
+              <w:pStyle w:val="Compact"/>
+              <w:jc w:val="left"/>
+            </w:pPr>
+            <w:r>
+              <w:t xml:space="preserve">Rattle</w:t>
+            </w:r>
+          </w:p>
+        </w:tc>
+        <w:tc>
+          <w:tcPr/>
+          <w:p>
+            <w:pPr>
+              <w:pStyle w:val="Compact"/>
+              <w:jc w:val="right"/>
+            </w:pPr>
+            <w:r>
+              <w:t xml:space="preserve">12</w:t>
+            </w:r>
+          </w:p>
+        </w:tc>
+        <w:tc>
+          <w:tcPr/>
+          <w:p>
+            <w:pPr>
+              <w:pStyle w:val="Compact"/>
+              <w:jc w:val="right"/>
+            </w:pPr>
+            <w:r>
+              <w:t xml:space="preserve">4</w:t>
+            </w:r>
+          </w:p>
+        </w:tc>
+        <w:tc>
+          <w:tcPr/>
+          <w:p>
+            <w:pPr>
+              <w:pStyle w:val="Compact"/>
+              <w:jc w:val="right"/>
+            </w:pPr>
+            <w:r>
+              <w:t xml:space="preserve">4</w:t>
+            </w:r>
+          </w:p>
+        </w:tc>
+      </w:tr>
+      <w:tr>
+        <w:tc>
+          <w:tcPr/>
+          <w:p>
+            <w:pPr>
+              <w:pStyle w:val="Compact"/>
+              <w:jc w:val="right"/>
+            </w:pPr>
+            <w:r>
+              <w:t xml:space="preserve">2022</w:t>
+            </w:r>
+          </w:p>
+        </w:tc>
+        <w:tc>
+          <w:tcPr/>
+          <w:p>
+            <w:pPr>
+              <w:pStyle w:val="Compact"/>
+              <w:jc w:val="left"/>
+            </w:pPr>
+            <w:r>
+              <w:t xml:space="preserve">Rattle</w:t>
+            </w:r>
+          </w:p>
+        </w:tc>
+        <w:tc>
+          <w:tcPr/>
+          <w:p>
+            <w:pPr>
+              <w:pStyle w:val="Compact"/>
+              <w:jc w:val="right"/>
+            </w:pPr>
+            <w:r>
+              <w:t xml:space="preserve">34</w:t>
+            </w:r>
+          </w:p>
+        </w:tc>
+        <w:tc>
+          <w:tcPr/>
+          <w:p>
+            <w:pPr>
+              <w:pStyle w:val="Compact"/>
+              <w:jc w:val="right"/>
+            </w:pPr>
+            <w:r>
+              <w:t xml:space="preserve">8</w:t>
+            </w:r>
+          </w:p>
+        </w:tc>
+        <w:tc>
+          <w:tcPr/>
+          <w:p>
+            <w:pPr>
+              <w:pStyle w:val="Compact"/>
+              <w:jc w:val="right"/>
+            </w:pPr>
+            <w:r>
+              <w:t xml:space="preserve">8</w:t>
+            </w:r>
+          </w:p>
+        </w:tc>
+      </w:tr>
+      <w:tr>
+        <w:tc>
+          <w:tcPr/>
+          <w:p>
+            <w:pPr>
+              <w:pStyle w:val="Compact"/>
+              <w:jc w:val="right"/>
+            </w:pPr>
+            <w:r>
+              <w:t xml:space="preserve">2022</w:t>
+            </w:r>
+          </w:p>
+        </w:tc>
+        <w:tc>
+          <w:tcPr/>
+          <w:p>
+            <w:pPr>
+              <w:pStyle w:val="Compact"/>
+              <w:jc w:val="left"/>
+            </w:pPr>
+            <w:r>
+              <w:t xml:space="preserve">Control</w:t>
+            </w:r>
+          </w:p>
+        </w:tc>
+        <w:tc>
+          <w:tcPr/>
+          <w:p>
+            <w:pPr>
+              <w:pStyle w:val="Compact"/>
+              <w:jc w:val="right"/>
+            </w:pPr>
+            <w:r>
+              <w:t xml:space="preserve">54</w:t>
+            </w:r>
+          </w:p>
+        </w:tc>
+        <w:tc>
+          <w:tcPr/>
+          <w:p>
+            <w:pPr>
+              <w:pStyle w:val="Compact"/>
+              <w:jc w:val="right"/>
+            </w:pPr>
+            <w:r>
+              <w:t xml:space="preserve">12</w:t>
+            </w:r>
+          </w:p>
+        </w:tc>
+        <w:tc>
+          <w:tcPr/>
+          <w:p>
+            <w:pPr>
+              <w:pStyle w:val="Compact"/>
+              <w:jc w:val="right"/>
+            </w:pPr>
+            <w:r>
+              <w:t xml:space="preserve">12</w:t>
+            </w:r>
+          </w:p>
+        </w:tc>
+      </w:tr>
+      <w:tr>
+        <w:tc>
+          <w:tcPr/>
+          <w:p>
+            <w:pPr>
+              <w:pStyle w:val="Compact"/>
+              <w:jc w:val="right"/>
+            </w:pPr>
+            <w:r>
+              <w:t xml:space="preserve">2021</w:t>
+            </w:r>
+          </w:p>
+        </w:tc>
+        <w:tc>
+          <w:tcPr/>
+          <w:p>
+            <w:pPr>
+              <w:pStyle w:val="Compact"/>
+              <w:jc w:val="left"/>
+            </w:pPr>
+            <w:r>
+              <w:t xml:space="preserve">Chickadee</w:t>
+            </w:r>
+          </w:p>
+        </w:tc>
+        <w:tc>
+          <w:tcPr/>
+          <w:p>
+            <w:pPr>
+              <w:pStyle w:val="Compact"/>
+              <w:jc w:val="right"/>
+            </w:pPr>
+            <w:r>
+              <w:t xml:space="preserve">6</w:t>
+            </w:r>
+          </w:p>
+        </w:tc>
+        <w:tc>
+          <w:tcPr/>
+          <w:p>
+            <w:pPr>
+              <w:pStyle w:val="Compact"/>
+              <w:jc w:val="right"/>
+            </w:pPr>
+            <w:r>
+              <w:t xml:space="preserve">2</w:t>
+            </w:r>
+          </w:p>
+        </w:tc>
+        <w:tc>
+          <w:tcPr/>
+          <w:p>
+            <w:pPr>
+              <w:pStyle w:val="Compact"/>
+              <w:jc w:val="right"/>
+            </w:pPr>
+            <w:r>
+              <w:t xml:space="preserve">2</w:t>
             </w:r>
           </w:p>
         </w:tc>

</xml_diff>